<commit_message>
feat(generador): solucion de documento del pliego
</commit_message>
<xml_diff>
--- a/src/generador-documentos/templates/pliego-condiciones-template.docx
+++ b/src/generador-documentos/templates/pliego-condiciones-template.docx
@@ -11169,7 +11169,7 @@
           <w:szCs w:val="24"/>
           <w:rtl w:val="0"/>
         </w:rPr>
-        <w:t xml:space="preserve">Este documento no constituye un causal de RECHAZO DE LA OFERTA.</w:t>
+        <w:t xml:space="preserve">Este documento no constituye un causal de RECHAZO DE LA OFERTA.{/mod_declaracion_autocalculo_van_au_au}</w:t>
       </w:r>
     </w:p>
     <w:p>
@@ -33851,7 +33851,7 @@
           <w:szCs w:val="24"/>
           <w:rtl w:val="0"/>
         </w:rPr>
-        <w:t xml:space="preserve">Firma y sello</w:t>
+        <w:t xml:space="preserve">Firma y sello{/mod_declaracion_autocalculo_van_au_au}</w:t>
       </w:r>
     </w:p>
     <w:p>

</xml_diff>